<commit_message>
Reduce bold emphasis and rebalance the Capgemini entry
The documents used bold inside running prose for metrics and keywords, which
made the page noisy rather than scannable. Bold is now reserved for structure
only: bullet lead-in labels, institution names, and the addressee block in the
letter. The profile paragraph is plain prose throughout.

The Capgemini entry ran to nine bullets against two or three for every earlier
role, which read as disproportionate. Condensed to six by folding workshops
into requirements-to-solution-design, demos and adoption into the agentic AI
bullet, and SAP knowledge management into the S/4HANA test management bullet.
No coverage of the job ad is lost.

The reclaimed space goes back into the type: body size 8.9pt to 9.15pt with
looser leading and more room between sections and roles. Still two pages.

Co-Authored-By: Claude Opus 5 <noreply@anthropic.com>
Claude-Session: https://claude.ai/code/session_0124sHEXJ8vE4tPjxizMVrwP
</commit_message>
<xml_diff>
--- a/applications/sap-fioneer/Mehreen_Himani_CV_SAP_Fioneer_Senior_Solution_Manager.docx
+++ b/applications/sap-fioneer/Mehreen_Himani_CV_SAP_Fioneer_Senior_Solution_Manager.docx
@@ -309,121 +309,7 @@
           <w:i w:val="0"/>
           <w:sz w:val="18"/>
         </w:rPr>
-        <w:t xml:space="preserve">Product &amp; Solution Manager with </w:t>
-      </w:r>
-      <w:r>
-        <w:rPr>
-          <w:rFonts w:ascii="Georgia" w:hAnsi="Georgia"/>
-          <w:b/>
-          <w:i w:val="0"/>
-          <w:color w:val="000000"/>
-          <w:sz w:val="18"/>
-        </w:rPr>
-        <w:t>13+ years in regulated financial services</w:t>
-      </w:r>
-      <w:r>
-        <w:rPr>
-          <w:rFonts w:ascii="Georgia" w:hAnsi="Georgia"/>
-          <w:b w:val="0"/>
-          <w:i w:val="0"/>
-          <w:sz w:val="18"/>
-        </w:rPr>
-        <w:t xml:space="preserve"> and </w:t>
-      </w:r>
-      <w:r>
-        <w:rPr>
-          <w:rFonts w:ascii="Georgia" w:hAnsi="Georgia"/>
-          <w:b/>
-          <w:i w:val="0"/>
-          <w:color w:val="000000"/>
-          <w:sz w:val="18"/>
-        </w:rPr>
-        <w:t>8+ years in hybrid business–technology roles</w:t>
-      </w:r>
-      <w:r>
-        <w:rPr>
-          <w:rFonts w:ascii="Georgia" w:hAnsi="Georgia"/>
-          <w:b w:val="0"/>
-          <w:i w:val="0"/>
-          <w:sz w:val="18"/>
-        </w:rPr>
-        <w:t xml:space="preserve"> (Solution Manager, Product Owner, Business Technology Analyst) — working at the intersection of banking business and AI technology. Deep </w:t>
-      </w:r>
-      <w:r>
-        <w:rPr>
-          <w:rFonts w:ascii="Georgia" w:hAnsi="Georgia"/>
-          <w:b/>
-          <w:i w:val="0"/>
-          <w:color w:val="000000"/>
-          <w:sz w:val="18"/>
-        </w:rPr>
-        <w:t>core banking process expertise across accounts, deposits, lending, payments, post-trade and financial crime</w:t>
-      </w:r>
-      <w:r>
-        <w:rPr>
-          <w:rFonts w:ascii="Georgia" w:hAnsi="Georgia"/>
-          <w:b w:val="0"/>
-          <w:i w:val="0"/>
-          <w:sz w:val="18"/>
-        </w:rPr>
-        <w:t xml:space="preserve">, built at UBS, Standard Chartered, Credit Suisse and Capgemini. </w:t>
-      </w:r>
-      <w:r>
-        <w:rPr>
-          <w:rFonts w:ascii="Georgia" w:hAnsi="Georgia"/>
-          <w:b/>
-          <w:i w:val="0"/>
-          <w:color w:val="000000"/>
-          <w:sz w:val="18"/>
-        </w:rPr>
-        <w:t>Hands-on with (agentic) AI</w:t>
-      </w:r>
-      <w:r>
-        <w:rPr>
-          <w:rFonts w:ascii="Georgia" w:hAnsi="Georgia"/>
-          <w:b w:val="0"/>
-          <w:i w:val="0"/>
-          <w:sz w:val="18"/>
-        </w:rPr>
-        <w:t xml:space="preserve"> — multi-agent orchestration, prompt and context engineering, model configuration, RAG and LLM evaluation — with </w:t>
-      </w:r>
-      <w:r>
-        <w:rPr>
-          <w:rFonts w:ascii="Georgia" w:hAnsi="Georgia"/>
-          <w:b/>
-          <w:i w:val="0"/>
-          <w:color w:val="000000"/>
-          <w:sz w:val="18"/>
-        </w:rPr>
-        <w:t>7 production AI products shipped in the last 12 months</w:t>
-      </w:r>
-      <w:r>
-        <w:rPr>
-          <w:rFonts w:ascii="Georgia" w:hAnsi="Georgia"/>
-          <w:b w:val="0"/>
-          <w:i w:val="0"/>
-          <w:sz w:val="18"/>
-        </w:rPr>
-        <w:t xml:space="preserve">. Identifies opportunities with business and sales stakeholders, derives and structures requirements, translates them into technical solution designs with AI engineers and architects, and builds the prototypes and demos that prove business value. Working knowledge of </w:t>
-      </w:r>
-      <w:r>
-        <w:rPr>
-          <w:rFonts w:ascii="Georgia" w:hAnsi="Georgia"/>
-          <w:b/>
-          <w:i w:val="0"/>
-          <w:color w:val="000000"/>
-          <w:sz w:val="18"/>
-        </w:rPr>
-        <w:t>SAP landscapes and S/4HANA</w:t>
-      </w:r>
-      <w:r>
-        <w:rPr>
-          <w:rFonts w:ascii="Georgia" w:hAnsi="Georgia"/>
-          <w:b w:val="0"/>
-          <w:i w:val="0"/>
-          <w:sz w:val="18"/>
-        </w:rPr>
-        <w:t xml:space="preserve"> (test management, knowledge management, migration delivery). English C1, German B1.</w:t>
+        <w:t>Product &amp; Solution Manager with 13+ years in regulated financial services and 8+ years in hybrid business–technology roles (Solution Manager, Product Owner, Business Technology Analyst), working at the intersection of banking business and AI technology. Deep core banking process expertise across accounts, deposits, lending, payments, post-trade and financial crime, built at UBS, Standard Chartered, Credit Suisse and Capgemini. Hands-on with agentic AI — multi-agent orchestration, prompt and context engineering, model configuration, RAG and LLM evaluation — with seven production AI products shipped in the last 12 months. Identifies opportunities with business and sales stakeholders, derives and structures requirements, translates them into technical solution designs with AI engineers and architects, and builds the prototypes and demos that prove business value. Working knowledge of SAP landscapes and S/4HANA across test management, knowledge management and migration delivery. English C1, German B1.</w:t>
       </w:r>
     </w:p>
     <w:p>
@@ -665,83 +551,7 @@
           <w:i w:val="0"/>
           <w:sz w:val="18"/>
         </w:rPr>
-        <w:t xml:space="preserve"> work alongside </w:t>
-      </w:r>
-      <w:r>
-        <w:rPr>
-          <w:rFonts w:ascii="Georgia" w:hAnsi="Georgia"/>
-          <w:b/>
-          <w:i w:val="0"/>
-          <w:color w:val="000000"/>
-          <w:sz w:val="18"/>
-        </w:rPr>
-        <w:t>sales, pre-sales and account leadership</w:t>
-      </w:r>
-      <w:r>
-        <w:rPr>
-          <w:rFonts w:ascii="Georgia" w:hAnsi="Georgia"/>
-          <w:b w:val="0"/>
-          <w:i w:val="0"/>
-          <w:sz w:val="18"/>
-        </w:rPr>
-        <w:t xml:space="preserve"> to identify and qualify AI-based innovation opportunities across banking clients and internal business units — shaped </w:t>
-      </w:r>
-      <w:r>
-        <w:rPr>
-          <w:rFonts w:ascii="Georgia" w:hAnsi="Georgia"/>
-          <w:b/>
-          <w:i w:val="0"/>
-          <w:color w:val="000000"/>
-          <w:sz w:val="18"/>
-        </w:rPr>
-        <w:t>12+ AI use cases</w:t>
-      </w:r>
-      <w:r>
-        <w:rPr>
-          <w:rFonts w:ascii="Georgia" w:hAnsi="Georgia"/>
-          <w:b w:val="0"/>
-          <w:i w:val="0"/>
-          <w:sz w:val="18"/>
-        </w:rPr>
-        <w:t xml:space="preserve"> spanning accounts, lending, payments and compliance operations, quantified </w:t>
-      </w:r>
-      <w:r>
-        <w:rPr>
-          <w:rFonts w:ascii="Georgia" w:hAnsi="Georgia"/>
-          <w:b/>
-          <w:i w:val="0"/>
-          <w:color w:val="000000"/>
-          <w:sz w:val="18"/>
-        </w:rPr>
-        <w:t>$600K+ in annual savings potential</w:t>
-      </w:r>
-      <w:r>
-        <w:rPr>
-          <w:rFonts w:ascii="Georgia" w:hAnsi="Georgia"/>
-          <w:b w:val="0"/>
-          <w:i w:val="0"/>
-          <w:sz w:val="18"/>
-        </w:rPr>
-        <w:t xml:space="preserve">, and drove a </w:t>
-      </w:r>
-      <w:r>
-        <w:rPr>
-          <w:rFonts w:ascii="Georgia" w:hAnsi="Georgia"/>
-          <w:b/>
-          <w:i w:val="0"/>
-          <w:color w:val="000000"/>
-          <w:sz w:val="18"/>
-        </w:rPr>
-        <w:t>3x increase in AI pilot proposals within three months</w:t>
-      </w:r>
-      <w:r>
-        <w:rPr>
-          <w:rFonts w:ascii="Georgia" w:hAnsi="Georgia"/>
-          <w:b w:val="0"/>
-          <w:i w:val="0"/>
-          <w:sz w:val="18"/>
-        </w:rPr>
-        <w:t>.</w:t>
+        <w:t xml:space="preserve"> work alongside sales, pre-sales and account leadership to identify and qualify AI-based innovation opportunities across banking clients and internal business units — shaped 12+ AI use cases spanning accounts, lending, payments and compliance operations, quantified $600K+ in annual savings potential, and drove a 3x increase in AI pilot proposals within three months.</w:t>
       </w:r>
     </w:p>
     <w:p>
@@ -759,7 +569,7 @@
           <w:color w:val="000000"/>
           <w:sz w:val="18"/>
         </w:rPr>
-        <w:t>QA Radar — product built with the sales team:</w:t>
+        <w:t>QA Radar, built with the sales team:</w:t>
       </w:r>
       <w:r>
         <w:rPr>
@@ -768,26 +578,7 @@
           <w:i w:val="0"/>
           <w:sz w:val="18"/>
         </w:rPr>
-        <w:t xml:space="preserve"> co-created </w:t>
-      </w:r>
-      <w:r>
-        <w:rPr>
-          <w:rFonts w:ascii="Georgia" w:hAnsi="Georgia"/>
-          <w:b/>
-          <w:i w:val="0"/>
-          <w:color w:val="000000"/>
-          <w:sz w:val="18"/>
-        </w:rPr>
-        <w:t>“QA Radar”</w:t>
-      </w:r>
-      <w:r>
-        <w:rPr>
-          <w:rFonts w:ascii="Georgia" w:hAnsi="Georgia"/>
-          <w:b w:val="0"/>
-          <w:i w:val="0"/>
-          <w:sz w:val="18"/>
-        </w:rPr>
-        <w:t xml:space="preserve"> with sales, turning delivery and quality data into an opportunity-intelligence asset used for account planning, client positioning and bid support — giving sales an evidence-based conversation starter and converting delivery insight into a repeatable pipeline generator.</w:t>
+        <w:t xml:space="preserve"> co-created an opportunity-intelligence product that turns delivery and quality data into an evidence-based asset for account planning, client positioning and bid support — converting delivery insight into a repeatable pipeline generator.</w:t>
       </w:r>
     </w:p>
     <w:p>
@@ -814,64 +605,7 @@
           <w:i w:val="0"/>
           <w:sz w:val="18"/>
         </w:rPr>
-        <w:t xml:space="preserve"> run discovery with senior business and product stakeholders; gather, structure and prioritise </w:t>
-      </w:r>
-      <w:r>
-        <w:rPr>
-          <w:rFonts w:ascii="Georgia" w:hAnsi="Georgia"/>
-          <w:b/>
-          <w:i w:val="0"/>
-          <w:color w:val="000000"/>
-          <w:sz w:val="18"/>
-        </w:rPr>
-        <w:t>business and technical requirements</w:t>
-      </w:r>
-      <w:r>
-        <w:rPr>
-          <w:rFonts w:ascii="Georgia" w:hAnsi="Georgia"/>
-          <w:b w:val="0"/>
-          <w:i w:val="0"/>
-          <w:sz w:val="18"/>
-        </w:rPr>
-        <w:t xml:space="preserve"> for AI use cases against customer value and operational feasibility, then translate business goals into </w:t>
-      </w:r>
-      <w:r>
-        <w:rPr>
-          <w:rFonts w:ascii="Georgia" w:hAnsi="Georgia"/>
-          <w:b/>
-          <w:i w:val="0"/>
-          <w:color w:val="000000"/>
-          <w:sz w:val="18"/>
-        </w:rPr>
-        <w:t>solution designs and technical concepts</w:t>
-      </w:r>
-      <w:r>
-        <w:rPr>
-          <w:rFonts w:ascii="Georgia" w:hAnsi="Georgia"/>
-          <w:b w:val="0"/>
-          <w:i w:val="0"/>
-          <w:sz w:val="18"/>
-        </w:rPr>
-        <w:t xml:space="preserve"> with AI engineers, architects, developers and core banking / SAP teams — </w:t>
-      </w:r>
-      <w:r>
-        <w:rPr>
-          <w:rFonts w:ascii="Georgia" w:hAnsi="Georgia"/>
-          <w:b/>
-          <w:i w:val="0"/>
-          <w:color w:val="000000"/>
-          <w:sz w:val="18"/>
-        </w:rPr>
-        <w:t>85% stakeholder alignment achieved in the first sprint cycle</w:t>
-      </w:r>
-      <w:r>
-        <w:rPr>
-          <w:rFonts w:ascii="Georgia" w:hAnsi="Georgia"/>
-          <w:b w:val="0"/>
-          <w:i w:val="0"/>
-          <w:sz w:val="18"/>
-        </w:rPr>
-        <w:t>.</w:t>
+        <w:t xml:space="preserve"> lead discovery and cross-functional workshops with senior business and product stakeholders; gather, structure and prioritise business and technical requirements against customer value and operational feasibility, then translate business goals into solution designs with AI engineers, architects, developers and core banking / SAP teams — 85% stakeholder alignment in the first sprint cycle.</w:t>
       </w:r>
     </w:p>
     <w:p>
@@ -889,7 +623,7 @@
           <w:color w:val="000000"/>
           <w:sz w:val="18"/>
         </w:rPr>
-        <w:t>Hands-on agentic AI ownership:</w:t>
+        <w:t>Hands-on agentic AI and prototyping:</w:t>
       </w:r>
       <w:r>
         <w:rPr>
@@ -898,45 +632,7 @@
           <w:i w:val="0"/>
           <w:sz w:val="18"/>
         </w:rPr>
-        <w:t xml:space="preserve"> design, configure and iterate </w:t>
-      </w:r>
-      <w:r>
-        <w:rPr>
-          <w:rFonts w:ascii="Georgia" w:hAnsi="Georgia"/>
-          <w:b/>
-          <w:i w:val="0"/>
-          <w:color w:val="000000"/>
-          <w:sz w:val="18"/>
-        </w:rPr>
-        <w:t>multi-agent workflows</w:t>
-      </w:r>
-      <w:r>
-        <w:rPr>
-          <w:rFonts w:ascii="Georgia" w:hAnsi="Georgia"/>
-          <w:b w:val="0"/>
-          <w:i w:val="0"/>
-          <w:sz w:val="18"/>
-        </w:rPr>
-        <w:t xml:space="preserve"> (planner → reviewer → summarizer) with tool use, retrieval grounding and a three-layer guardrail pipeline; personally handle </w:t>
-      </w:r>
-      <w:r>
-        <w:rPr>
-          <w:rFonts w:ascii="Georgia" w:hAnsi="Georgia"/>
-          <w:b/>
-          <w:i w:val="0"/>
-          <w:color w:val="000000"/>
-          <w:sz w:val="18"/>
-        </w:rPr>
-        <w:t>prompt engineering, context engineering, model configuration and data interaction</w:t>
-      </w:r>
-      <w:r>
-        <w:rPr>
-          <w:rFonts w:ascii="Georgia" w:hAnsi="Georgia"/>
-          <w:b w:val="0"/>
-          <w:i w:val="0"/>
-          <w:sz w:val="18"/>
-        </w:rPr>
-        <w:t>, then advance working prototypes into standard, reusable enhancements.</w:t>
+        <w:t xml:space="preserve"> design and configure multi-agent workflows (planner → reviewer → summarizer) with tool use, retrieval grounding and layered guardrails, handling prompt engineering, context engineering, model configuration and data interaction personally; run executive solution demos and advance working prototypes into standard enhancements — adopted across 4 business units and 40+ users, with a 5-phase AI adoption playbook that became the organisational standard.</w:t>
       </w:r>
     </w:p>
     <w:p>
@@ -954,7 +650,7 @@
           <w:color w:val="000000"/>
           <w:sz w:val="18"/>
         </w:rPr>
-        <w:t>Solution demos, prototypes &amp; adoption:</w:t>
+        <w:t>AI evaluation and governance:</w:t>
       </w:r>
       <w:r>
         <w:rPr>
@@ -963,64 +659,7 @@
           <w:i w:val="0"/>
           <w:sz w:val="18"/>
         </w:rPr>
-        <w:t xml:space="preserve"> build and run </w:t>
-      </w:r>
-      <w:r>
-        <w:rPr>
-          <w:rFonts w:ascii="Georgia" w:hAnsi="Georgia"/>
-          <w:b/>
-          <w:i w:val="0"/>
-          <w:color w:val="000000"/>
-          <w:sz w:val="18"/>
-        </w:rPr>
-        <w:t>executive-level solution demos and working prototypes</w:t>
-      </w:r>
-      <w:r>
-        <w:rPr>
-          <w:rFonts w:ascii="Georgia" w:hAnsi="Georgia"/>
-          <w:b w:val="0"/>
-          <w:i w:val="0"/>
-          <w:sz w:val="18"/>
-        </w:rPr>
-        <w:t xml:space="preserve"> that translate abstract AI capability into concrete banking business outcomes — adopted across </w:t>
-      </w:r>
-      <w:r>
-        <w:rPr>
-          <w:rFonts w:ascii="Georgia" w:hAnsi="Georgia"/>
-          <w:b/>
-          <w:i w:val="0"/>
-          <w:color w:val="000000"/>
-          <w:sz w:val="18"/>
-        </w:rPr>
-        <w:t>4 business units and 40+ users</w:t>
-      </w:r>
-      <w:r>
-        <w:rPr>
-          <w:rFonts w:ascii="Georgia" w:hAnsi="Georgia"/>
-          <w:b w:val="0"/>
-          <w:i w:val="0"/>
-          <w:sz w:val="18"/>
-        </w:rPr>
-        <w:t xml:space="preserve"> in regulated compliance teams, with a </w:t>
-      </w:r>
-      <w:r>
-        <w:rPr>
-          <w:rFonts w:ascii="Georgia" w:hAnsi="Georgia"/>
-          <w:b/>
-          <w:i w:val="0"/>
-          <w:color w:val="000000"/>
-          <w:sz w:val="18"/>
-        </w:rPr>
-        <w:t>5-phase AI adoption playbook</w:t>
-      </w:r>
-      <w:r>
-        <w:rPr>
-          <w:rFonts w:ascii="Georgia" w:hAnsi="Georgia"/>
-          <w:b w:val="0"/>
-          <w:i w:val="0"/>
-          <w:sz w:val="18"/>
-        </w:rPr>
-        <w:t xml:space="preserve"> that became the organisational standard.</w:t>
+        <w:t xml:space="preserve"> built a lightweight LLM evaluation framework covering accuracy, consistency, safety, latency and cost, and embedded EU AI Act and DORA controls into agent reasoning and audit trails — +25% answer consistency, −40% hallucination rate, −30% model failure rate and a 35% efficiency improvement in targeted processes.</w:t>
       </w:r>
     </w:p>
     <w:p>
@@ -1038,7 +677,7 @@
           <w:color w:val="000000"/>
           <w:sz w:val="18"/>
         </w:rPr>
-        <w:t>AI evaluation, governance &amp; trust:</w:t>
+        <w:t>SAP S/4HANA test and knowledge management:</w:t>
       </w:r>
       <w:r>
         <w:rPr>
@@ -1047,240 +686,7 @@
           <w:i w:val="0"/>
           <w:sz w:val="18"/>
         </w:rPr>
-        <w:t xml:space="preserve"> designed a lightweight </w:t>
-      </w:r>
-      <w:r>
-        <w:rPr>
-          <w:rFonts w:ascii="Georgia" w:hAnsi="Georgia"/>
-          <w:b/>
-          <w:i w:val="0"/>
-          <w:color w:val="000000"/>
-          <w:sz w:val="18"/>
-        </w:rPr>
-        <w:t>LLM evaluation framework</w:t>
-      </w:r>
-      <w:r>
-        <w:rPr>
-          <w:rFonts w:ascii="Georgia" w:hAnsi="Georgia"/>
-          <w:b w:val="0"/>
-          <w:i w:val="0"/>
-          <w:sz w:val="18"/>
-        </w:rPr>
-        <w:t xml:space="preserve"> (accuracy, consistency, safety, latency, cost) and embedded </w:t>
-      </w:r>
-      <w:r>
-        <w:rPr>
-          <w:rFonts w:ascii="Georgia" w:hAnsi="Georgia"/>
-          <w:b/>
-          <w:i w:val="0"/>
-          <w:color w:val="000000"/>
-          <w:sz w:val="18"/>
-        </w:rPr>
-        <w:t>EU AI Act and DORA</w:t>
-      </w:r>
-      <w:r>
-        <w:rPr>
-          <w:rFonts w:ascii="Georgia" w:hAnsi="Georgia"/>
-          <w:b w:val="0"/>
-          <w:i w:val="0"/>
-          <w:sz w:val="18"/>
-        </w:rPr>
-        <w:t xml:space="preserve"> controls into agent reasoning and audit trails — </w:t>
-      </w:r>
-      <w:r>
-        <w:rPr>
-          <w:rFonts w:ascii="Georgia" w:hAnsi="Georgia"/>
-          <w:b/>
-          <w:i w:val="0"/>
-          <w:color w:val="000000"/>
-          <w:sz w:val="18"/>
-        </w:rPr>
-        <w:t>+25% answer consistency, −40% hallucination rate, −30% model failure rate</w:t>
-      </w:r>
-      <w:r>
-        <w:rPr>
-          <w:rFonts w:ascii="Georgia" w:hAnsi="Georgia"/>
-          <w:b w:val="0"/>
-          <w:i w:val="0"/>
-          <w:sz w:val="18"/>
-        </w:rPr>
-        <w:t xml:space="preserve"> and a </w:t>
-      </w:r>
-      <w:r>
-        <w:rPr>
-          <w:rFonts w:ascii="Georgia" w:hAnsi="Georgia"/>
-          <w:b/>
-          <w:i w:val="0"/>
-          <w:color w:val="000000"/>
-          <w:sz w:val="18"/>
-        </w:rPr>
-        <w:t>35% efficiency improvement</w:t>
-      </w:r>
-      <w:r>
-        <w:rPr>
-          <w:rFonts w:ascii="Georgia" w:hAnsi="Georgia"/>
-          <w:b w:val="0"/>
-          <w:i w:val="0"/>
-          <w:sz w:val="18"/>
-        </w:rPr>
-        <w:t xml:space="preserve"> in targeted processes.</w:t>
-      </w:r>
-    </w:p>
-    <w:p>
-      <w:pPr>
-        <w:pStyle w:val="ListBullet"/>
-        <w:spacing w:before="0" w:after="40" w:line="278" w:lineRule="auto"/>
-        <w:ind w:left="283"/>
-        <w:jc w:val="both"/>
-      </w:pPr>
-      <w:r>
-        <w:rPr>
-          <w:rFonts w:ascii="Georgia" w:hAnsi="Georgia"/>
-          <w:b/>
-          <w:i w:val="0"/>
-          <w:color w:val="000000"/>
-          <w:sz w:val="18"/>
-        </w:rPr>
-        <w:t>SAP test management &amp; S/4HANA migration:</w:t>
-      </w:r>
-      <w:r>
-        <w:rPr>
-          <w:rFonts w:ascii="Georgia" w:hAnsi="Georgia"/>
-          <w:b w:val="0"/>
-          <w:i w:val="0"/>
-          <w:sz w:val="18"/>
-        </w:rPr>
-        <w:t xml:space="preserve"> own </w:t>
-      </w:r>
-      <w:r>
-        <w:rPr>
-          <w:rFonts w:ascii="Georgia" w:hAnsi="Georgia"/>
-          <w:b/>
-          <w:i w:val="0"/>
-          <w:color w:val="000000"/>
-          <w:sz w:val="18"/>
-        </w:rPr>
-        <w:t>test strategy and test management for SAP S/4HANA migration</w:t>
-      </w:r>
-      <w:r>
-        <w:rPr>
-          <w:rFonts w:ascii="Georgia" w:hAnsi="Georgia"/>
-          <w:b w:val="0"/>
-          <w:i w:val="0"/>
-          <w:sz w:val="18"/>
-        </w:rPr>
-        <w:t xml:space="preserve"> programmes — risk-based scoping, requirement-to-test traceability, defect governance and release readiness sign-off with business process owners across finance and operations.</w:t>
-      </w:r>
-    </w:p>
-    <w:p>
-      <w:pPr>
-        <w:pStyle w:val="ListBullet"/>
-        <w:spacing w:before="0" w:after="40" w:line="278" w:lineRule="auto"/>
-        <w:ind w:left="283"/>
-        <w:jc w:val="both"/>
-      </w:pPr>
-      <w:r>
-        <w:rPr>
-          <w:rFonts w:ascii="Georgia" w:hAnsi="Georgia"/>
-          <w:b/>
-          <w:i w:val="0"/>
-          <w:color w:val="000000"/>
-          <w:sz w:val="18"/>
-        </w:rPr>
-        <w:t>SAP knowledge management:</w:t>
-      </w:r>
-      <w:r>
-        <w:rPr>
-          <w:rFonts w:ascii="Georgia" w:hAnsi="Georgia"/>
-          <w:b w:val="0"/>
-          <w:i w:val="0"/>
-          <w:sz w:val="18"/>
-        </w:rPr>
-        <w:t xml:space="preserve"> established a structured </w:t>
-      </w:r>
-      <w:r>
-        <w:rPr>
-          <w:rFonts w:ascii="Georgia" w:hAnsi="Georgia"/>
-          <w:b/>
-          <w:i w:val="0"/>
-          <w:color w:val="000000"/>
-          <w:sz w:val="18"/>
-        </w:rPr>
-        <w:t>SAP knowledge management practice</w:t>
-      </w:r>
-      <w:r>
-        <w:rPr>
-          <w:rFonts w:ascii="Georgia" w:hAnsi="Georgia"/>
-          <w:b w:val="0"/>
-          <w:i w:val="0"/>
-          <w:sz w:val="18"/>
-        </w:rPr>
-        <w:t xml:space="preserve"> (process documentation, reusable solution assets, onboarding enablement) and extended it with AI-assisted retrieval so teams receive </w:t>
-      </w:r>
-      <w:r>
-        <w:rPr>
-          <w:rFonts w:ascii="Georgia" w:hAnsi="Georgia"/>
-          <w:b/>
-          <w:i w:val="0"/>
-          <w:color w:val="000000"/>
-          <w:sz w:val="18"/>
-        </w:rPr>
-        <w:t>citation-grounded answers</w:t>
-      </w:r>
-      <w:r>
-        <w:rPr>
-          <w:rFonts w:ascii="Georgia" w:hAnsi="Georgia"/>
-          <w:b w:val="0"/>
-          <w:i w:val="0"/>
-          <w:sz w:val="18"/>
-        </w:rPr>
-        <w:t xml:space="preserve"> from SAP process and test artefacts instead of tribal knowledge.</w:t>
-      </w:r>
-    </w:p>
-    <w:p>
-      <w:pPr>
-        <w:pStyle w:val="ListBullet"/>
-        <w:spacing w:before="0" w:after="40" w:line="278" w:lineRule="auto"/>
-        <w:ind w:left="283"/>
-        <w:jc w:val="both"/>
-      </w:pPr>
-      <w:r>
-        <w:rPr>
-          <w:rFonts w:ascii="Georgia" w:hAnsi="Georgia"/>
-          <w:b/>
-          <w:i w:val="0"/>
-          <w:color w:val="000000"/>
-          <w:sz w:val="18"/>
-        </w:rPr>
-        <w:t>Workshops &amp; connector role:</w:t>
-      </w:r>
-      <w:r>
-        <w:rPr>
-          <w:rFonts w:ascii="Georgia" w:hAnsi="Georgia"/>
-          <w:b w:val="0"/>
-          <w:i w:val="0"/>
-          <w:sz w:val="18"/>
-        </w:rPr>
-        <w:t xml:space="preserve"> lead </w:t>
-      </w:r>
-      <w:r>
-        <w:rPr>
-          <w:rFonts w:ascii="Georgia" w:hAnsi="Georgia"/>
-          <w:b/>
-          <w:i w:val="0"/>
-          <w:color w:val="000000"/>
-          <w:sz w:val="18"/>
-        </w:rPr>
-        <w:t>cross-functional workshops</w:t>
-      </w:r>
-      <w:r>
-        <w:rPr>
-          <w:rFonts w:ascii="Georgia" w:hAnsi="Georgia"/>
-          <w:b w:val="0"/>
-          <w:i w:val="0"/>
-          <w:sz w:val="18"/>
-        </w:rPr>
-        <w:t xml:space="preserve"> and collaborative working sessions with international business and technical teams — acting as the bridge and translator between business expectation and technical execution.</w:t>
+        <w:t xml:space="preserve"> own test strategy and test management for SAP S/4HANA migration programmes — risk-based scoping, requirement-to-test traceability, defect governance and release readiness with business process owners; established the SAP knowledge management practice behind them and extended it with AI-assisted retrieval for citation-grounded answers from process and test artefacts.</w:t>
       </w:r>
     </w:p>
     <w:p>
@@ -1363,26 +769,7 @@
           <w:i w:val="0"/>
           <w:sz w:val="18"/>
         </w:rPr>
-        <w:t xml:space="preserve">Owned product vision and roadmap for the </w:t>
-      </w:r>
-      <w:r>
-        <w:rPr>
-          <w:rFonts w:ascii="Georgia" w:hAnsi="Georgia"/>
-          <w:b/>
-          <w:i w:val="0"/>
-          <w:color w:val="000000"/>
-          <w:sz w:val="18"/>
-        </w:rPr>
-        <w:t>Credit Risk Analytics Platform</w:t>
-      </w:r>
-      <w:r>
-        <w:rPr>
-          <w:rFonts w:ascii="Georgia" w:hAnsi="Georgia"/>
-          <w:b w:val="0"/>
-          <w:i w:val="0"/>
-          <w:sz w:val="18"/>
-        </w:rPr>
-        <w:t xml:space="preserve"> serving 50+ stakeholders (Risk, Finance, Compliance) — architected Basel III stress-testing and ECB FINREP reporting workflows; reduced forecast cycle from 5 days to 8 hours (73% faster).</w:t>
+        <w:t>Owned product vision and roadmap for the Credit Risk Analytics Platform serving 50+ stakeholders (Risk, Finance, Compliance) — architected Basel III stress-testing and ECB FINREP reporting workflows; reduced forecast cycle from 5 days to 8 hours (73% faster).</w:t>
       </w:r>
     </w:p>
     <w:p>
@@ -1399,26 +786,7 @@
           <w:i w:val="0"/>
           <w:sz w:val="18"/>
         </w:rPr>
-        <w:t xml:space="preserve">Prioritised </w:t>
-      </w:r>
-      <w:r>
-        <w:rPr>
-          <w:rFonts w:ascii="Georgia" w:hAnsi="Georgia"/>
-          <w:b/>
-          <w:i w:val="0"/>
-          <w:color w:val="000000"/>
-          <w:sz w:val="18"/>
-        </w:rPr>
-        <w:t>150+ credit risk features</w:t>
-      </w:r>
-      <w:r>
-        <w:rPr>
-          <w:rFonts w:ascii="Georgia" w:hAnsi="Georgia"/>
-          <w:b w:val="0"/>
-          <w:i w:val="0"/>
-          <w:sz w:val="18"/>
-        </w:rPr>
-        <w:t xml:space="preserve"> (RICE); implemented shift-left testing with BDD scenarios and 50+ automated validation checks — cut calculation errors 85% and audit findings 60%.</w:t>
+        <w:t>Prioritised 150+ credit risk features (RICE); implemented shift-left testing with BDD scenarios and 50+ automated validation checks — cut calculation errors 85% and audit findings 60%.</w:t>
       </w:r>
     </w:p>
     <w:p>
@@ -1493,26 +861,7 @@
           <w:i w:val="0"/>
           <w:sz w:val="18"/>
         </w:rPr>
-        <w:t xml:space="preserve">Redesigned alert prioritisation logic in </w:t>
-      </w:r>
-      <w:r>
-        <w:rPr>
-          <w:rFonts w:ascii="Georgia" w:hAnsi="Georgia"/>
-          <w:b/>
-          <w:i w:val="0"/>
-          <w:color w:val="000000"/>
-          <w:sz w:val="18"/>
-        </w:rPr>
-        <w:t>NICE Actimize</w:t>
-      </w:r>
-      <w:r>
-        <w:rPr>
-          <w:rFonts w:ascii="Georgia" w:hAnsi="Georgia"/>
-          <w:b w:val="0"/>
-          <w:i w:val="0"/>
-          <w:sz w:val="18"/>
-        </w:rPr>
-        <w:t xml:space="preserve"> — cut AML false positives 45%, saved 2,000+ analyst hours annually, and improved suspicious-activity detection 30%.</w:t>
+        <w:t>Redesigned alert prioritisation logic in NICE Actimize — cut AML false positives 45%, saved 2,000+ analyst hours annually, and improved suspicious-activity detection 30%.</w:t>
       </w:r>
     </w:p>
     <w:p>
@@ -1629,26 +978,7 @@
           <w:i w:val="0"/>
           <w:sz w:val="18"/>
         </w:rPr>
-        <w:t xml:space="preserve">Redesigned the </w:t>
-      </w:r>
-      <w:r>
-        <w:rPr>
-          <w:rFonts w:ascii="Georgia" w:hAnsi="Georgia"/>
-          <w:b/>
-          <w:i w:val="0"/>
-          <w:color w:val="000000"/>
-          <w:sz w:val="18"/>
-        </w:rPr>
-        <w:t>Loan Stress Testing</w:t>
-      </w:r>
-      <w:r>
-        <w:rPr>
-          <w:rFonts w:ascii="Georgia" w:hAnsi="Georgia"/>
-          <w:b w:val="0"/>
-          <w:i w:val="0"/>
-          <w:sz w:val="18"/>
-        </w:rPr>
-        <w:t xml:space="preserve"> experience; created a UX index predicting optimal update timing — reduced P&amp;L forecasting errors 20%.</w:t>
+        <w:t>Redesigned the Loan Stress Testing experience; created a UX index predicting optimal update timing — reduced P&amp;L forecasting errors 20%.</w:t>
       </w:r>
     </w:p>
     <w:p>
@@ -1723,26 +1053,7 @@
           <w:i w:val="0"/>
           <w:sz w:val="18"/>
         </w:rPr>
-        <w:t xml:space="preserve">Owned </w:t>
-      </w:r>
-      <w:r>
-        <w:rPr>
-          <w:rFonts w:ascii="Georgia" w:hAnsi="Georgia"/>
-          <w:b/>
-          <w:i w:val="0"/>
-          <w:color w:val="000000"/>
-          <w:sz w:val="18"/>
-        </w:rPr>
-        <w:t>$400K P&amp;L</w:t>
-      </w:r>
-      <w:r>
-        <w:rPr>
-          <w:rFonts w:ascii="Georgia" w:hAnsi="Georgia"/>
-          <w:b w:val="0"/>
-          <w:i w:val="0"/>
-          <w:sz w:val="18"/>
-        </w:rPr>
-        <w:t xml:space="preserve"> for post-trade settlement automation; introduced CI/CD, reducing regression testing time 60% and settlement failures 25%.</w:t>
+        <w:t>Owned $400K P&amp;L for post-trade settlement automation; introduced CI/CD, reducing regression testing time 60% and settlement failures 25%.</w:t>
       </w:r>
     </w:p>
     <w:p>
@@ -1817,26 +1128,7 @@
           <w:i w:val="0"/>
           <w:sz w:val="18"/>
         </w:rPr>
-        <w:t xml:space="preserve">Built </w:t>
-      </w:r>
-      <w:r>
-        <w:rPr>
-          <w:rFonts w:ascii="Georgia" w:hAnsi="Georgia"/>
-          <w:b/>
-          <w:i w:val="0"/>
-          <w:color w:val="000000"/>
-          <w:sz w:val="18"/>
-        </w:rPr>
-        <w:t>“Kandoo,”</w:t>
-      </w:r>
-      <w:r>
-        <w:rPr>
-          <w:rFonts w:ascii="Georgia" w:hAnsi="Georgia"/>
-          <w:b w:val="0"/>
-          <w:i w:val="0"/>
-          <w:sz w:val="18"/>
-        </w:rPr>
-        <w:t xml:space="preserve"> an internal automation tool adopted by PMs, POs and QA — saved $205K annually, cut end-to-end trade testing time 50%.</w:t>
+        <w:t>Built “Kandoo,” an internal automation tool adopted by PMs, POs and QA — saved $205K annually, cut end-to-end trade testing time 50%.</w:t>
       </w:r>
     </w:p>
     <w:p>

</xml_diff>